<commit_message>
Make demo guide literal and action-first
</commit_message>
<xml_diff>
--- a/docs/demo/docxodus-demo-guide.docx
+++ b/docs/demo/docxodus-demo-guide.docx
@@ -37,12 +37,13 @@
             </w:pPr>
             <w:r>
               <w:rPr>
+                <w:rFonts w:ascii="Arial" w:hAnsi="Arial" w:eastAsia="Arial"/>
                 <w:b/>
                 <w:i w:val="0"/>
                 <w:color w:val="13BBD4"/>
                 <w:sz w:val="18"/>
               </w:rPr>
-              <w:t>LIVE PRODUCT GUIDE  •  9.1</w:t>
+              <w:t>LIVE DOCX  •  CLICK INTO THE PAGE</w:t>
             </w:r>
           </w:p>
           <w:p>
@@ -50,9 +51,16 @@
               <w:pStyle w:val="Title"/>
             </w:pPr>
             <w:r>
-              <w:t>Your document just</w:t>
+              <w:rPr>
+                <w:rFonts w:ascii="Arial" w:hAnsi="Arial" w:eastAsia="Arial"/>
+                <w:b/>
+                <w:i w:val="0"/>
+                <w:color w:val="FFFFFF"/>
+                <w:sz w:val="68"/>
+              </w:rPr>
+              <w:t>Edit this document.</w:t>
               <w:br/>
-              <w:t>became an interface.</w:t>
+              <w:t>It’s real.</w:t>
             </w:r>
           </w:p>
           <w:p>
@@ -60,7 +68,14 @@
               <w:pStyle w:val="Subtitle"/>
             </w:pPr>
             <w:r>
-              <w:t>Render. Edit. Redline. Save. All inside this browser tab.</w:t>
+              <w:rPr>
+                <w:rFonts w:ascii="Arial" w:hAnsi="Arial" w:eastAsia="Arial"/>
+                <w:b w:val="0"/>
+                <w:i/>
+                <w:color w:val="BED7F5"/>
+                <w:sz w:val="28"/>
+              </w:rPr>
+              <w:t>Select text. Change it. Download the same Word file.</w:t>
             </w:r>
           </w:p>
         </w:tc>
@@ -107,12 +122,13 @@
             </w:pPr>
             <w:r>
               <w:rPr>
+                <w:rFonts w:ascii="Arial" w:hAnsi="Arial" w:eastAsia="Arial"/>
                 <w:b/>
                 <w:i w:val="0"/>
                 <w:color w:val="13BBD4"/>
                 <w:sz w:val="16"/>
               </w:rPr>
-              <w:t>LOCAL FIRST</w:t>
+              <w:t>1 / SELECT</w:t>
             </w:r>
           </w:p>
           <w:p>
@@ -121,12 +137,13 @@
             </w:pPr>
             <w:r>
               <w:rPr>
+                <w:rFonts w:ascii="Arial" w:hAnsi="Arial" w:eastAsia="Arial"/>
                 <w:b/>
                 <w:i w:val="0"/>
                 <w:color w:val="142238"/>
                 <w:sz w:val="19"/>
               </w:rPr>
-              <w:t>Your file never uploads</w:t>
+              <w:t>Highlight text on this page</w:t>
             </w:r>
           </w:p>
         </w:tc>
@@ -153,12 +170,13 @@
             </w:pPr>
             <w:r>
               <w:rPr>
+                <w:rFonts w:ascii="Arial" w:hAnsi="Arial" w:eastAsia="Arial"/>
                 <w:b/>
                 <w:i w:val="0"/>
                 <w:color w:val="245BDB"/>
                 <w:sz w:val="16"/>
               </w:rPr>
-              <w:t>WORD NATIVE</w:t>
+              <w:t>2 / EDIT</w:t>
             </w:r>
           </w:p>
           <w:p>
@@ -167,12 +185,13 @@
             </w:pPr>
             <w:r>
               <w:rPr>
+                <w:rFonts w:ascii="Arial" w:hAnsi="Arial" w:eastAsia="Arial"/>
                 <w:b/>
                 <w:i w:val="0"/>
                 <w:color w:val="142238"/>
                 <w:sz w:val="19"/>
               </w:rPr>
-              <w:t>OOXML stays editable</w:t>
+              <w:t>Use the live toolbar above</w:t>
             </w:r>
           </w:p>
         </w:tc>
@@ -199,12 +218,13 @@
             </w:pPr>
             <w:r>
               <w:rPr>
+                <w:rFonts w:ascii="Arial" w:hAnsi="Arial" w:eastAsia="Arial"/>
                 <w:b/>
                 <w:i w:val="0"/>
                 <w:color w:val="7655D9"/>
                 <w:sz w:val="16"/>
               </w:rPr>
-              <w:t>LOSSLESS OUT</w:t>
+              <w:t>3 / DOWNLOAD</w:t>
             </w:r>
           </w:p>
           <w:p>
@@ -213,12 +233,13 @@
             </w:pPr>
             <w:r>
               <w:rPr>
+                <w:rFonts w:ascii="Arial" w:hAnsi="Arial" w:eastAsia="Arial"/>
                 <w:b/>
                 <w:i w:val="0"/>
                 <w:color w:val="142238"/>
                 <w:sz w:val="19"/>
               </w:rPr>
-              <w:t>Save a real .docx</w:t>
+              <w:t>Open the result in Word</w:t>
             </w:r>
           </w:p>
         </w:tc>
@@ -235,12 +256,13 @@
       </w:pPr>
       <w:r>
         <w:rPr>
+          <w:rFonts w:ascii="Arial" w:hAnsi="Arial" w:eastAsia="Arial"/>
           <w:b/>
           <w:i w:val="0"/>
           <w:color w:val="245BDB"/>
           <w:sz w:val="18"/>
         </w:rPr>
-        <w:t>THIS FILE IS THE TOUR</w:t>
+        <w:t>TRY IT NOW  •  20-SECOND PROOF</w:t>
       </w:r>
     </w:p>
     <w:p>
@@ -249,89 +271,60 @@
         <w:spacing w:before="0"/>
       </w:pPr>
       <w:r>
-        <w:t>Welcome to Docxodus.</w:t>
+        <w:t>Make the sentence below bold.</w:t>
       </w:r>
     </w:p>
     <w:p>
       <w:r>
         <w:rPr>
+          <w:rFonts w:ascii="Arial" w:hAnsi="Arial" w:eastAsia="Arial"/>
           <w:b w:val="0"/>
           <w:i w:val="0"/>
           <w:color w:val="52657D"/>
         </w:rPr>
-        <w:t>You are looking at a real Word document, rendered and editable without sending it to a server. Use the toolbar above on the content below; every change is written back to native DOCX structure.</w:t>
+        <w:t>Drag across the purple sentence to select it, then click B in the toolbar above.</w:t>
       </w:r>
     </w:p>
-    <w:tbl>
-      <w:tblPr>
-        <w:tblW w:type="auto" w:w="0"/>
-        <w:jc w:val="center"/>
-        <w:tblLayout w:type="fixed"/>
-        <w:tblLook w:firstColumn="1" w:firstRow="1" w:lastColumn="0" w:lastRow="0" w:noHBand="0" w:noVBand="1" w:val="04A0"/>
-      </w:tblPr>
-      <w:tblGrid>
-        <w:gridCol w:w="10166"/>
-      </w:tblGrid>
-      <w:tr>
-        <w:tc>
-          <w:tcPr>
-            <w:tcW w:type="dxa" w:w="9936"/>
-            <w:shd w:fill="E8FAFC"/>
-            <w:tcMar>
-              <w:top w:w="180" w:type="dxa"/>
-              <w:start w:w="220" w:type="dxa"/>
-              <w:bottom w:w="180" w:type="dxa"/>
-              <w:end w:w="220" w:type="dxa"/>
-            </w:tcMar>
-            <w:tcBorders>
-              <w:start w:val="single" w:sz="28" w:space="0" w:color="13BBD4"/>
-            </w:tcBorders>
-          </w:tcPr>
-          <w:p>
-            <w:pPr>
-              <w:spacing w:after="80"/>
-            </w:pPr>
-            <w:r>
-              <w:rPr>
-                <w:b/>
-                <w:i w:val="0"/>
-                <w:color w:val="13BBD4"/>
-                <w:sz w:val="16"/>
-              </w:rPr>
-              <w:t>START HERE</w:t>
-            </w:r>
-          </w:p>
-          <w:p>
-            <w:pPr>
-              <w:spacing w:after="80"/>
-            </w:pPr>
-            <w:r>
-              <w:rPr>
-                <w:b/>
-                <w:i w:val="0"/>
-                <w:color w:val="142238"/>
-                <w:sz w:val="26"/>
-              </w:rPr>
-              <w:t>Select this sentence and make it unmistakably yours.</w:t>
-            </w:r>
-          </w:p>
-          <w:p>
-            <w:pPr>
-              <w:spacing w:after="0"/>
-            </w:pPr>
-            <w:r>
-              <w:rPr>
-                <w:b w:val="0"/>
-                <w:i w:val="0"/>
-                <w:color w:val="52657D"/>
-                <w:sz w:val="19"/>
-              </w:rPr>
-              <w:t>Try bold, italic, underline, strike, 18 pt, and centered alignment—then use Undo and Redo to watch the document model follow along.</w:t>
-            </w:r>
-          </w:p>
-        </w:tc>
-      </w:tr>
-    </w:tbl>
+    <w:p>
+      <w:pPr>
+        <w:spacing w:before="100" w:after="0"/>
+        <w:ind w:left="230" w:right="230"/>
+        <w:shd w:fill="F1EDFF"/>
+        <w:pBdr>
+          <w:left w:val="single" w:sz="26" w:space="10" w:color="7655D9"/>
+        </w:pBdr>
+      </w:pPr>
+      <w:r>
+        <w:rPr>
+          <w:rFonts w:ascii="Arial" w:hAnsi="Arial" w:eastAsia="Arial"/>
+          <w:b/>
+          <w:i w:val="0"/>
+          <w:color w:val="7655D9"/>
+          <w:sz w:val="16"/>
+        </w:rPr>
+        <w:t>SELECT ONLY THIS SENTENCE</w:t>
+      </w:r>
+    </w:p>
+    <w:p>
+      <w:pPr>
+        <w:spacing w:before="0" w:after="100"/>
+        <w:ind w:left="230" w:right="230"/>
+        <w:shd w:fill="F1EDFF"/>
+        <w:pBdr>
+          <w:left w:val="single" w:sz="26" w:space="10" w:color="7655D9"/>
+        </w:pBdr>
+      </w:pPr>
+      <w:r>
+        <w:rPr>
+          <w:rFonts w:ascii="Arial" w:hAnsi="Arial" w:eastAsia="Arial"/>
+          <w:b w:val="0"/>
+          <w:i w:val="0"/>
+          <w:color w:val="142238"/>
+          <w:sz w:val="26"/>
+        </w:rPr>
+        <w:t>This is a real Word document. Make this sentence bold.</w:t>
+      </w:r>
+    </w:p>
     <w:p>
       <w:pPr>
         <w:spacing w:after="0"/>
@@ -343,12 +336,13 @@
       </w:pPr>
       <w:r>
         <w:rPr>
+          <w:rFonts w:ascii="Arial" w:hAnsi="Arial" w:eastAsia="Arial"/>
           <w:b/>
           <w:i w:val="0"/>
           <w:color w:val="7655D9"/>
           <w:sz w:val="18"/>
         </w:rPr>
-        <w:t>FOUR QUICK WINS</w:t>
+        <w:t>WHAT TO DO</w:t>
       </w:r>
     </w:p>
     <w:tbl>
@@ -387,6 +381,7 @@
           <w:p>
             <w:r>
               <w:rPr>
+                <w:rFonts w:ascii="Arial" w:hAnsi="Arial" w:eastAsia="Arial"/>
                 <w:b/>
                 <w:i w:val="0"/>
                 <w:color w:val="FFFFFF"/>
@@ -398,7 +393,7 @@
         </w:tc>
         <w:tc>
           <w:tcPr>
-            <w:tcW w:type="dxa" w:w="2160"/>
+            <w:tcW w:type="dxa" w:w="3427"/>
             <w:shd w:fill="102A46"/>
             <w:tcMar>
               <w:top w:w="100" w:type="dxa"/>
@@ -416,18 +411,19 @@
           <w:p>
             <w:r>
               <w:rPr>
+                <w:rFonts w:ascii="Arial" w:hAnsi="Arial" w:eastAsia="Arial"/>
                 <w:b/>
                 <w:i w:val="0"/>
                 <w:color w:val="FFFFFF"/>
                 <w:sz w:val="16"/>
               </w:rPr>
-              <w:t>CONTROL</w:t>
+              <w:t>DO THIS</w:t>
             </w:r>
           </w:p>
         </w:tc>
         <w:tc>
           <w:tcPr>
-            <w:tcW w:type="dxa" w:w="6696"/>
+            <w:tcW w:type="dxa" w:w="5429"/>
             <w:shd w:fill="102A46"/>
             <w:tcMar>
               <w:top w:w="100" w:type="dxa"/>
@@ -445,12 +441,13 @@
           <w:p>
             <w:r>
               <w:rPr>
+                <w:rFonts w:ascii="Arial" w:hAnsi="Arial" w:eastAsia="Arial"/>
                 <w:b/>
                 <w:i w:val="0"/>
                 <w:color w:val="FFFFFF"/>
                 <w:sz w:val="16"/>
               </w:rPr>
-              <w:t>WHAT TO TRY</w:t>
+              <w:t>YOU SHOULD SEE</w:t>
             </w:r>
           </w:p>
         </w:tc>
@@ -476,6 +473,7 @@
           <w:p>
             <w:r>
               <w:rPr>
+                <w:rFonts w:ascii="Arial" w:hAnsi="Arial" w:eastAsia="Arial"/>
                 <w:b/>
                 <w:i w:val="0"/>
                 <w:color w:val="245BDB"/>
@@ -487,7 +485,7 @@
         </w:tc>
         <w:tc>
           <w:tcPr>
-            <w:tcW w:type="dxa" w:w="2160"/>
+            <w:tcW w:type="dxa" w:w="3427"/>
             <w:shd w:fill="F7FAFD"/>
             <w:tcMar>
               <w:top w:w="110" w:type="dxa"/>
@@ -505,19 +503,19 @@
           <w:p>
             <w:r>
               <w:rPr>
-                <w:rFonts w:ascii="Aptos Mono" w:hAnsi="Aptos Mono" w:eastAsia="Aptos Mono"/>
+                <w:rFonts w:ascii="Arial" w:hAnsi="Arial" w:eastAsia="Arial"/>
                 <w:b/>
                 <w:i w:val="0"/>
                 <w:color w:val="142238"/>
                 <w:sz w:val="17"/>
               </w:rPr>
-              <w:t>B  I  U  S</w:t>
+              <w:t>Select the purple sentence</w:t>
             </w:r>
           </w:p>
         </w:tc>
         <w:tc>
           <w:tcPr>
-            <w:tcW w:type="dxa" w:w="6696"/>
+            <w:tcW w:type="dxa" w:w="5429"/>
             <w:shd w:fill="F7FAFD"/>
             <w:tcMar>
               <w:top w:w="110" w:type="dxa"/>
@@ -535,12 +533,13 @@
           <w:p>
             <w:r>
               <w:rPr>
+                <w:rFonts w:ascii="Arial" w:hAnsi="Arial" w:eastAsia="Arial"/>
                 <w:b w:val="0"/>
                 <w:i w:val="0"/>
                 <w:color w:val="142238"/>
                 <w:sz w:val="18"/>
               </w:rPr>
-              <w:t>Select the practice sentence below, then combine inline styles.</w:t>
+              <w:t>A blue text selection appears.</w:t>
             </w:r>
           </w:p>
         </w:tc>
@@ -566,6 +565,7 @@
           <w:p>
             <w:r>
               <w:rPr>
+                <w:rFonts w:ascii="Arial" w:hAnsi="Arial" w:eastAsia="Arial"/>
                 <w:b/>
                 <w:i w:val="0"/>
                 <w:color w:val="245BDB"/>
@@ -577,7 +577,7 @@
         </w:tc>
         <w:tc>
           <w:tcPr>
-            <w:tcW w:type="dxa" w:w="2160"/>
+            <w:tcW w:type="dxa" w:w="3427"/>
             <w:shd w:fill="FFFFFF"/>
             <w:tcMar>
               <w:top w:w="110" w:type="dxa"/>
@@ -595,19 +595,19 @@
           <w:p>
             <w:r>
               <w:rPr>
-                <w:rFonts w:ascii="Aptos Mono" w:hAnsi="Aptos Mono" w:eastAsia="Aptos Mono"/>
+                <w:rFonts w:ascii="Arial" w:hAnsi="Arial" w:eastAsia="Arial"/>
                 <w:b/>
                 <w:i w:val="0"/>
                 <w:color w:val="142238"/>
                 <w:sz w:val="17"/>
               </w:rPr>
-              <w:t>12 pt  ↕</w:t>
+              <w:t>Click B in the toolbar</w:t>
             </w:r>
           </w:p>
         </w:tc>
         <w:tc>
           <w:tcPr>
-            <w:tcW w:type="dxa" w:w="6696"/>
+            <w:tcW w:type="dxa" w:w="5429"/>
             <w:shd w:fill="FFFFFF"/>
             <w:tcMar>
               <w:top w:w="110" w:type="dxa"/>
@@ -625,12 +625,13 @@
           <w:p>
             <w:r>
               <w:rPr>
+                <w:rFonts w:ascii="Arial" w:hAnsi="Arial" w:eastAsia="Arial"/>
                 <w:b w:val="0"/>
                 <w:i w:val="0"/>
                 <w:color w:val="142238"/>
                 <w:sz w:val="18"/>
               </w:rPr>
-              <w:t>Change font size, alignment, and indentation. Undo it. Redo it.</w:t>
+              <w:t>The sentence becomes bold.</w:t>
             </w:r>
           </w:p>
         </w:tc>
@@ -656,6 +657,7 @@
           <w:p>
             <w:r>
               <w:rPr>
+                <w:rFonts w:ascii="Arial" w:hAnsi="Arial" w:eastAsia="Arial"/>
                 <w:b/>
                 <w:i w:val="0"/>
                 <w:color w:val="245BDB"/>
@@ -667,7 +669,7 @@
         </w:tc>
         <w:tc>
           <w:tcPr>
-            <w:tcW w:type="dxa" w:w="2160"/>
+            <w:tcW w:type="dxa" w:w="3427"/>
             <w:shd w:fill="F7FAFD"/>
             <w:tcMar>
               <w:top w:w="110" w:type="dxa"/>
@@ -685,19 +687,19 @@
           <w:p>
             <w:r>
               <w:rPr>
-                <w:rFonts w:ascii="Aptos Mono" w:hAnsi="Aptos Mono" w:eastAsia="Aptos Mono"/>
+                <w:rFonts w:ascii="Arial" w:hAnsi="Arial" w:eastAsia="Arial"/>
                 <w:b/>
                 <w:i w:val="0"/>
                 <w:color w:val="142238"/>
                 <w:sz w:val="17"/>
               </w:rPr>
-              <w:t>•≡  1≡  ▦</w:t>
+              <w:t>Click Undo, then Redo</w:t>
             </w:r>
           </w:p>
         </w:tc>
         <w:tc>
           <w:tcPr>
-            <w:tcW w:type="dxa" w:w="6696"/>
+            <w:tcW w:type="dxa" w:w="5429"/>
             <w:shd w:fill="F7FAFD"/>
             <w:tcMar>
               <w:top w:w="110" w:type="dxa"/>
@@ -715,12 +717,13 @@
           <w:p>
             <w:r>
               <w:rPr>
+                <w:rFonts w:ascii="Arial" w:hAnsi="Arial" w:eastAsia="Arial"/>
                 <w:b w:val="0"/>
                 <w:i w:val="0"/>
                 <w:color w:val="142238"/>
                 <w:sz w:val="18"/>
               </w:rPr>
-              <w:t>Turn a paragraph into a list, then insert a table or horizontal rule.</w:t>
+              <w:t>The formatting disappears and returns.</w:t>
             </w:r>
           </w:p>
         </w:tc>
@@ -746,6 +749,7 @@
           <w:p>
             <w:r>
               <w:rPr>
+                <w:rFonts w:ascii="Arial" w:hAnsi="Arial" w:eastAsia="Arial"/>
                 <w:b/>
                 <w:i w:val="0"/>
                 <w:color w:val="245BDB"/>
@@ -757,7 +761,7 @@
         </w:tc>
         <w:tc>
           <w:tcPr>
-            <w:tcW w:type="dxa" w:w="2160"/>
+            <w:tcW w:type="dxa" w:w="3427"/>
             <w:shd w:fill="FFFFFF"/>
             <w:tcMar>
               <w:top w:w="110" w:type="dxa"/>
@@ -775,19 +779,19 @@
           <w:p>
             <w:r>
               <w:rPr>
-                <w:rFonts w:ascii="Aptos Mono" w:hAnsi="Aptos Mono" w:eastAsia="Aptos Mono"/>
+                <w:rFonts w:ascii="Arial" w:hAnsi="Arial" w:eastAsia="Arial"/>
                 <w:b/>
                 <w:i w:val="0"/>
                 <w:color w:val="142238"/>
                 <w:sz w:val="17"/>
               </w:rPr>
-              <w:t>▱  ↓</w:t>
+              <w:t>Click Download .docx</w:t>
             </w:r>
           </w:p>
         </w:tc>
         <w:tc>
           <w:tcPr>
-            <w:tcW w:type="dxa" w:w="6696"/>
+            <w:tcW w:type="dxa" w:w="5429"/>
             <w:shd w:fill="FFFFFF"/>
             <w:tcMar>
               <w:top w:w="110" w:type="dxa"/>
@@ -805,12 +809,91 @@
           <w:p>
             <w:r>
               <w:rPr>
+                <w:rFonts w:ascii="Arial" w:hAnsi="Arial" w:eastAsia="Arial"/>
                 <w:b w:val="0"/>
                 <w:i w:val="0"/>
                 <w:color w:val="142238"/>
                 <w:sz w:val="18"/>
               </w:rPr>
-              <w:t>Switch to Pages, inspect the layout, then download the edited DOCX.</w:t>
+              <w:t>A real Word file saves to your device.</w:t>
+            </w:r>
+          </w:p>
+        </w:tc>
+      </w:tr>
+    </w:tbl>
+    <w:p>
+      <w:pPr>
+        <w:spacing w:after="0"/>
+      </w:pPr>
+    </w:p>
+    <w:tbl>
+      <w:tblPr>
+        <w:tblW w:type="auto" w:w="0"/>
+        <w:jc w:val="center"/>
+        <w:tblLayout w:type="fixed"/>
+        <w:tblLook w:firstColumn="1" w:firstRow="1" w:lastColumn="0" w:lastRow="0" w:noHBand="0" w:noVBand="1" w:val="04A0"/>
+      </w:tblPr>
+      <w:tblGrid>
+        <w:gridCol w:w="10166"/>
+      </w:tblGrid>
+      <w:tr>
+        <w:tc>
+          <w:tcPr>
+            <w:tcW w:type="dxa" w:w="9936"/>
+            <w:shd w:fill="E8FAFC"/>
+            <w:tcMar>
+              <w:top w:w="180" w:type="dxa"/>
+              <w:start w:w="220" w:type="dxa"/>
+              <w:bottom w:w="180" w:type="dxa"/>
+              <w:end w:w="220" w:type="dxa"/>
+            </w:tcMar>
+            <w:tcBorders>
+              <w:start w:val="single" w:sz="28" w:space="0" w:color="13BBD4"/>
+            </w:tcBorders>
+          </w:tcPr>
+          <w:p>
+            <w:pPr>
+              <w:spacing w:after="80"/>
+            </w:pPr>
+            <w:r>
+              <w:rPr>
+                <w:rFonts w:ascii="Arial" w:hAnsi="Arial" w:eastAsia="Arial"/>
+                <w:b/>
+                <w:i w:val="0"/>
+                <w:color w:val="13BBD4"/>
+                <w:sz w:val="16"/>
+              </w:rPr>
+              <w:t>THE PROOF</w:t>
+            </w:r>
+          </w:p>
+          <w:p>
+            <w:pPr>
+              <w:spacing w:after="80"/>
+            </w:pPr>
+            <w:r>
+              <w:rPr>
+                <w:rFonts w:ascii="Arial" w:hAnsi="Arial" w:eastAsia="Arial"/>
+                <w:b/>
+                <w:i w:val="0"/>
+                <w:color w:val="142238"/>
+                <w:sz w:val="26"/>
+              </w:rPr>
+              <w:t>Open the download in Word or LibreOffice.</w:t>
+            </w:r>
+          </w:p>
+          <w:p>
+            <w:pPr>
+              <w:spacing w:after="0"/>
+            </w:pPr>
+            <w:r>
+              <w:rPr>
+                <w:rFonts w:ascii="Arial" w:hAnsi="Arial" w:eastAsia="Arial"/>
+                <w:b w:val="0"/>
+                <w:i w:val="0"/>
+                <w:color w:val="52657D"/>
+                <w:sz w:val="19"/>
+              </w:rPr>
+              <w:t>Your sentence is still bold because the browser edited the DOCX itself—not a screenshot, canvas, or HTML copy.</w:t>
             </w:r>
           </w:p>
         </w:tc>
@@ -827,12 +910,13 @@
       </w:pPr>
       <w:r>
         <w:rPr>
+          <w:rFonts w:ascii="Arial" w:hAnsi="Arial" w:eastAsia="Arial"/>
           <w:b/>
           <w:i w:val="0"/>
           <w:color w:val="13BBD4"/>
           <w:sz w:val="18"/>
         </w:rPr>
-        <w:t>01 / HANDS-ON LAB</w:t>
+        <w:t>01 / GUIDED TUTORIAL</w:t>
       </w:r>
     </w:p>
     <w:p>
@@ -840,17 +924,18 @@
         <w:pStyle w:val="Heading1"/>
       </w:pPr>
       <w:r>
-        <w:t>Make the toolbar prove itself.</w:t>
+        <w:t>Now try the rest.</w:t>
       </w:r>
     </w:p>
     <w:p>
       <w:r>
         <w:rPr>
+          <w:rFonts w:ascii="Arial" w:hAnsi="Arial" w:eastAsia="Arial"/>
           <w:b w:val="0"/>
           <w:i w:val="0"/>
           <w:color w:val="52657D"/>
         </w:rPr>
-        <w:t>Every exercise below targets actual WordprocessingML. The visual change you see is the same change that survives in the downloaded file.</w:t>
+        <w:t>Work straight down this page. Each exercise takes a few seconds and changes real WordprocessingML in the open document.</w:t>
       </w:r>
     </w:p>
     <w:p>
@@ -858,44 +943,58 @@
         <w:pStyle w:val="Heading2"/>
       </w:pPr>
       <w:r>
-        <w:t>Inline style playground</w:t>
+        <w:t>1. Mix inline styles</w:t>
       </w:r>
     </w:p>
     <w:p>
       <w:pPr>
-        <w:spacing w:before="160" w:after="160"/>
-        <w:ind w:left="173" w:right="173"/>
-        <w:jc w:val="center"/>
-        <w:shd w:fill="F1EDFF"/>
+        <w:spacing w:before="100" w:after="0"/>
+        <w:ind w:left="230" w:right="230"/>
+        <w:shd w:fill="EAF3FF"/>
         <w:pBdr>
-          <w:top w:val="single" w:sz="7" w:space="8" w:color="7655D9"/>
-          <w:bottom w:val="single" w:sz="7" w:space="8" w:color="7655D9"/>
-          <w:left w:val="single" w:sz="7" w:space="8" w:color="7655D9"/>
-          <w:right w:val="single" w:sz="7" w:space="8" w:color="7655D9"/>
+          <w:left w:val="single" w:sz="26" w:space="10" w:color="245BDB"/>
         </w:pBdr>
       </w:pPr>
       <w:r>
         <w:rPr>
-          <w:b w:val="0"/>
+          <w:rFonts w:ascii="Arial" w:hAnsi="Arial" w:eastAsia="Arial"/>
+          <w:b/>
           <w:i w:val="0"/>
-          <w:color w:val="7655D9"/>
-          <w:sz w:val="24"/>
+          <w:color w:val="245BDB"/>
+          <w:sz w:val="16"/>
         </w:rPr>
-        <w:t>SELECT ME → Design is not decoration; it is clarity made visible.</w:t>
+        <w:t>PRACTICE LINE</w:t>
       </w:r>
     </w:p>
     <w:p>
       <w:pPr>
-        <w:jc w:val="center"/>
+        <w:spacing w:before="0" w:after="100"/>
+        <w:ind w:left="230" w:right="230"/>
+        <w:shd w:fill="EAF3FF"/>
+        <w:pBdr>
+          <w:left w:val="single" w:sz="26" w:space="10" w:color="245BDB"/>
+        </w:pBdr>
       </w:pPr>
       <w:r>
         <w:rPr>
+          <w:rFonts w:ascii="Arial" w:hAnsi="Arial" w:eastAsia="Arial"/>
+          <w:b w:val="0"/>
+          <w:i w:val="0"/>
+          <w:color w:val="142238"/>
+          <w:sz w:val="26"/>
+        </w:rPr>
+        <w:t>A real Word document is editable in this browser.</w:t>
+      </w:r>
+    </w:p>
+    <w:p>
+      <w:r>
+        <w:rPr>
+          <w:rFonts w:ascii="Arial" w:hAnsi="Arial" w:eastAsia="Arial"/>
           <w:b w:val="0"/>
           <w:i w:val="0"/>
           <w:color w:val="52657D"/>
-          <w:sz w:val="18"/>
         </w:rPr>
-        <w:t>Combine B / I / U / S, then try superscript, subscript, and a different point size.</w:t>
+        <w:t>Select a few words. Try italic, underline, strike, superscript, subscript, and a different point size.</w:t>
       </w:r>
     </w:p>
     <w:p>
@@ -903,79 +1002,66 @@
         <w:pStyle w:val="Heading2"/>
       </w:pPr>
       <w:r>
-        <w:t>Shape paragraphs</w:t>
+        <w:t>2. Change a whole paragraph</w:t>
       </w:r>
     </w:p>
     <w:p>
       <w:pPr>
-        <w:pStyle w:val="ListBullet"/>
-        <w:spacing w:after="100"/>
+        <w:spacing w:before="100" w:after="0"/>
+        <w:ind w:left="230" w:right="230"/>
+        <w:shd w:fill="E8FAFC"/>
+        <w:pBdr>
+          <w:left w:val="single" w:sz="26" w:space="10" w:color="13BBD4"/>
+        </w:pBdr>
       </w:pPr>
       <w:r>
         <w:rPr>
+          <w:rFonts w:ascii="Arial" w:hAnsi="Arial" w:eastAsia="Arial"/>
           <w:b/>
           <w:i w:val="0"/>
           <w:color w:val="13BBD4"/>
-          <w:sz w:val="20"/>
+          <w:sz w:val="16"/>
         </w:rPr>
-        <w:t>Alignment</w:t>
-      </w:r>
-      <w:r>
-        <w:rPr>
-          <w:b w:val="0"/>
-          <w:i w:val="0"/>
-          <w:color w:val="52657D"/>
-          <w:sz w:val="20"/>
-        </w:rPr>
-        <w:t xml:space="preserve"> — Move a paragraph left, center, right, or justify it.</w:t>
+        <w:t>CLICK ANYWHERE IN THIS PARAGRAPH</w:t>
       </w:r>
     </w:p>
     <w:p>
       <w:pPr>
-        <w:pStyle w:val="ListBullet"/>
-        <w:spacing w:after="100"/>
+        <w:spacing w:before="0" w:after="100"/>
+        <w:ind w:left="230" w:right="230"/>
+        <w:shd w:fill="E8FAFC"/>
+        <w:pBdr>
+          <w:left w:val="single" w:sz="26" w:space="10" w:color="13BBD4"/>
+        </w:pBdr>
       </w:pPr>
       <w:r>
         <w:rPr>
-          <w:b/>
+          <w:rFonts w:ascii="Arial" w:hAnsi="Arial" w:eastAsia="Arial"/>
+          <w:b w:val="0"/>
           <w:i w:val="0"/>
-          <w:color w:val="245BDB"/>
-          <w:sz w:val="20"/>
+          <w:color w:val="142238"/>
+          <w:sz w:val="26"/>
         </w:rPr>
-        <w:t>Lists</w:t>
+        <w:t>Center this paragraph, set it to 18 pt, then increase its indent.</w:t>
       </w:r>
+    </w:p>
+    <w:p>
       <w:r>
         <w:rPr>
+          <w:rFonts w:ascii="Arial" w:hAnsi="Arial" w:eastAsia="Arial"/>
           <w:b w:val="0"/>
           <w:i w:val="0"/>
           <w:color w:val="52657D"/>
-          <w:sz w:val="20"/>
         </w:rPr>
-        <w:t xml:space="preserve"> — Toggle bullets or numbering without flattening the paragraph.</w:t>
+        <w:t>Use the alignment and font-size menus, then the indent arrows. Undo each step if you want to start over.</w:t>
       </w:r>
     </w:p>
     <w:p>
       <w:pPr>
-        <w:pStyle w:val="ListBullet"/>
-        <w:spacing w:after="100"/>
+        <w:pStyle w:val="Heading2"/>
       </w:pPr>
       <w:r>
-        <w:rPr>
-          <w:b/>
-          <w:i w:val="0"/>
-          <w:color w:val="7655D9"/>
-          <w:sz w:val="20"/>
-        </w:rPr>
-        <w:t>Indentation</w:t>
-      </w:r>
-      <w:r>
-        <w:rPr>
-          <w:b w:val="0"/>
-          <w:i w:val="0"/>
-          <w:color w:val="52657D"/>
-          <w:sz w:val="20"/>
-        </w:rPr>
-        <w:t xml:space="preserve"> — Nudge structure in or out by one clean step.</w:t>
+        <w:t>3. Add real structure</w:t>
       </w:r>
     </w:p>
     <w:tbl>
@@ -1009,12 +1095,13 @@
             </w:pPr>
             <w:r>
               <w:rPr>
+                <w:rFonts w:ascii="Arial" w:hAnsi="Arial" w:eastAsia="Arial"/>
                 <w:b/>
                 <w:i w:val="0"/>
                 <w:color w:val="159B72"/>
                 <w:sz w:val="16"/>
               </w:rPr>
-              <w:t>TRY A STRUCTURAL EDIT</w:t>
+              <w:t>PUT THE CARET AT THE END OF THIS SENTENCE</w:t>
             </w:r>
           </w:p>
           <w:p>
@@ -1023,12 +1110,13 @@
             </w:pPr>
             <w:r>
               <w:rPr>
+                <w:rFonts w:ascii="Arial" w:hAnsi="Arial" w:eastAsia="Arial"/>
                 <w:b/>
                 <w:i w:val="0"/>
                 <w:color w:val="142238"/>
                 <w:sz w:val="26"/>
               </w:rPr>
-              <w:t>Place your cursor here, then insert something new.</w:t>
+              <w:t>Insert a table, rule, or footnote.</w:t>
             </w:r>
           </w:p>
           <w:p>
@@ -1037,12 +1125,13 @@
             </w:pPr>
             <w:r>
               <w:rPr>
+                <w:rFonts w:ascii="Arial" w:hAnsi="Arial" w:eastAsia="Arial"/>
                 <w:b w:val="0"/>
                 <w:i w:val="0"/>
                 <w:color w:val="52657D"/>
                 <w:sz w:val="19"/>
               </w:rPr>
-              <w:t>Add a 2 × 2 table, a horizontal rule, or a footnote. Structural controls create native document parts—not visual approximations.</w:t>
+              <w:t>Use ▦ for a 2 × 2 table, ― for a horizontal rule, or ¹ for a footnote. Each one becomes native document structure.</w:t>
             </w:r>
           </w:p>
         </w:tc>
@@ -1053,7 +1142,138 @@
         <w:pStyle w:val="Heading2"/>
       </w:pPr>
       <w:r>
-        <w:t>A table worth preserving</w:t>
+        <w:t>4. Make a list</w:t>
+      </w:r>
+    </w:p>
+    <w:p>
+      <w:r>
+        <w:rPr>
+          <w:rFonts w:ascii="Arial" w:hAnsi="Arial" w:eastAsia="Arial"/>
+          <w:b w:val="0"/>
+          <w:i w:val="0"/>
+          <w:color w:val="52657D"/>
+        </w:rPr>
+        <w:t>Click this paragraph, then press •≡ for bullets or 1≡ for numbering. Use the indent arrows to change its level.</w:t>
+      </w:r>
+    </w:p>
+    <w:tbl>
+      <w:tblPr>
+        <w:tblW w:type="auto" w:w="0"/>
+        <w:jc w:val="center"/>
+        <w:tblLayout w:type="fixed"/>
+        <w:tblLook w:firstColumn="1" w:firstRow="1" w:lastColumn="0" w:lastRow="0" w:noHBand="0" w:noVBand="1" w:val="04A0"/>
+      </w:tblPr>
+      <w:tblGrid>
+        <w:gridCol w:w="10166"/>
+      </w:tblGrid>
+      <w:tr>
+        <w:tc>
+          <w:tcPr>
+            <w:tcW w:type="dxa" w:w="9936"/>
+            <w:shd w:fill="F1EDFF"/>
+            <w:tcMar>
+              <w:top w:w="180" w:type="dxa"/>
+              <w:start w:w="220" w:type="dxa"/>
+              <w:bottom w:w="180" w:type="dxa"/>
+              <w:end w:w="220" w:type="dxa"/>
+            </w:tcMar>
+            <w:tcBorders>
+              <w:start w:val="single" w:sz="28" w:space="0" w:color="7655D9"/>
+            </w:tcBorders>
+          </w:tcPr>
+          <w:p>
+            <w:pPr>
+              <w:spacing w:after="80"/>
+            </w:pPr>
+            <w:r>
+              <w:rPr>
+                <w:rFonts w:ascii="Arial" w:hAnsi="Arial" w:eastAsia="Arial"/>
+                <w:b/>
+                <w:i w:val="0"/>
+                <w:color w:val="7655D9"/>
+                <w:sz w:val="16"/>
+              </w:rPr>
+              <w:t>SAFE TO EXPERIMENT</w:t>
+            </w:r>
+          </w:p>
+          <w:p>
+            <w:pPr>
+              <w:spacing w:after="80"/>
+            </w:pPr>
+            <w:r>
+              <w:rPr>
+                <w:rFonts w:ascii="Arial" w:hAnsi="Arial" w:eastAsia="Arial"/>
+                <w:b/>
+                <w:i w:val="0"/>
+                <w:color w:val="142238"/>
+                <w:sz w:val="26"/>
+              </w:rPr>
+              <w:t>Undo and Redo are real history.</w:t>
+            </w:r>
+          </w:p>
+          <w:p>
+            <w:pPr>
+              <w:spacing w:after="0"/>
+            </w:pPr>
+            <w:r>
+              <w:rPr>
+                <w:rFonts w:ascii="Arial" w:hAnsi="Arial" w:eastAsia="Arial"/>
+                <w:b w:val="0"/>
+                <w:i w:val="0"/>
+                <w:color w:val="52657D"/>
+                <w:sz w:val="19"/>
+              </w:rPr>
+              <w:t>Make a mess. Reverse it. Restore it. The editor keeps the rest of the document stable while the active block changes.</w:t>
+            </w:r>
+          </w:p>
+        </w:tc>
+      </w:tr>
+    </w:tbl>
+    <w:p>
+      <w:r>
+        <w:br w:type="page"/>
+      </w:r>
+    </w:p>
+    <w:p>
+      <w:pPr>
+        <w:pStyle w:val="Kicker"/>
+      </w:pPr>
+      <w:r>
+        <w:rPr>
+          <w:rFonts w:ascii="Arial" w:hAnsi="Arial" w:eastAsia="Arial"/>
+          <w:b/>
+          <w:i w:val="0"/>
+          <w:color w:val="13BBD4"/>
+          <w:sz w:val="18"/>
+        </w:rPr>
+        <w:t>02 / WHAT SURVIVES</w:t>
+      </w:r>
+    </w:p>
+    <w:p>
+      <w:pPr>
+        <w:pStyle w:val="Heading1"/>
+      </w:pPr>
+      <w:r>
+        <w:t>Open the download. Inspect the proof.</w:t>
+      </w:r>
+    </w:p>
+    <w:p>
+      <w:r>
+        <w:rPr>
+          <w:rFonts w:ascii="Arial" w:hAnsi="Arial" w:eastAsia="Arial"/>
+          <w:b w:val="0"/>
+          <w:i w:val="0"/>
+          <w:color w:val="52657D"/>
+        </w:rPr>
+        <w:t>The edited file is still a structured DOCX. Text stays text, tables stay tables, and document relationships remain document relationships.</w:t>
+      </w:r>
+    </w:p>
+    <w:p>
+      <w:pPr>
+        <w:pStyle w:val="Heading2"/>
+      </w:pPr>
+      <w:r>
+        <w:t>What Docxodus preserves</w:t>
       </w:r>
     </w:p>
     <w:tbl>
@@ -1092,6 +1312,7 @@
           <w:p>
             <w:r>
               <w:rPr>
+                <w:rFonts w:ascii="Arial" w:hAnsi="Arial" w:eastAsia="Arial"/>
                 <w:b/>
                 <w:i w:val="0"/>
                 <w:color w:val="FFFFFF"/>
@@ -1121,6 +1342,7 @@
           <w:p>
             <w:r>
               <w:rPr>
+                <w:rFonts w:ascii="Arial" w:hAnsi="Arial" w:eastAsia="Arial"/>
                 <w:b/>
                 <w:i w:val="0"/>
                 <w:color w:val="FFFFFF"/>
@@ -1150,6 +1372,7 @@
           <w:p>
             <w:r>
               <w:rPr>
+                <w:rFonts w:ascii="Arial" w:hAnsi="Arial" w:eastAsia="Arial"/>
                 <w:b/>
                 <w:i w:val="0"/>
                 <w:color w:val="FFFFFF"/>
@@ -1181,6 +1404,7 @@
           <w:p>
             <w:r>
               <w:rPr>
+                <w:rFonts w:ascii="Arial" w:hAnsi="Arial" w:eastAsia="Arial"/>
                 <w:b/>
                 <w:i w:val="0"/>
                 <w:color w:val="142238"/>
@@ -1210,6 +1434,7 @@
           <w:p>
             <w:r>
               <w:rPr>
+                <w:rFonts w:ascii="Arial" w:hAnsi="Arial" w:eastAsia="Arial"/>
                 <w:b w:val="0"/>
                 <w:i w:val="0"/>
                 <w:color w:val="52657D"/>
@@ -1239,6 +1464,7 @@
           <w:p>
             <w:r>
               <w:rPr>
+                <w:rFonts w:ascii="Arial" w:hAnsi="Arial" w:eastAsia="Arial"/>
                 <w:b w:val="0"/>
                 <w:i w:val="0"/>
                 <w:color w:val="52657D"/>
@@ -1270,6 +1496,7 @@
           <w:p>
             <w:r>
               <w:rPr>
+                <w:rFonts w:ascii="Arial" w:hAnsi="Arial" w:eastAsia="Arial"/>
                 <w:b/>
                 <w:i w:val="0"/>
                 <w:color w:val="142238"/>
@@ -1299,6 +1526,7 @@
           <w:p>
             <w:r>
               <w:rPr>
+                <w:rFonts w:ascii="Arial" w:hAnsi="Arial" w:eastAsia="Arial"/>
                 <w:b w:val="0"/>
                 <w:i w:val="0"/>
                 <w:color w:val="52657D"/>
@@ -1328,6 +1556,7 @@
           <w:p>
             <w:r>
               <w:rPr>
+                <w:rFonts w:ascii="Arial" w:hAnsi="Arial" w:eastAsia="Arial"/>
                 <w:b w:val="0"/>
                 <w:i w:val="0"/>
                 <w:color w:val="52657D"/>
@@ -1359,6 +1588,7 @@
           <w:p>
             <w:r>
               <w:rPr>
+                <w:rFonts w:ascii="Arial" w:hAnsi="Arial" w:eastAsia="Arial"/>
                 <w:b/>
                 <w:i w:val="0"/>
                 <w:color w:val="142238"/>
@@ -1388,6 +1618,7 @@
           <w:p>
             <w:r>
               <w:rPr>
+                <w:rFonts w:ascii="Arial" w:hAnsi="Arial" w:eastAsia="Arial"/>
                 <w:b w:val="0"/>
                 <w:i w:val="0"/>
                 <w:color w:val="52657D"/>
@@ -1417,6 +1648,7 @@
           <w:p>
             <w:r>
               <w:rPr>
+                <w:rFonts w:ascii="Arial" w:hAnsi="Arial" w:eastAsia="Arial"/>
                 <w:b w:val="0"/>
                 <w:i w:val="0"/>
                 <w:color w:val="52657D"/>
@@ -1448,6 +1680,7 @@
           <w:p>
             <w:r>
               <w:rPr>
+                <w:rFonts w:ascii="Arial" w:hAnsi="Arial" w:eastAsia="Arial"/>
                 <w:b/>
                 <w:i w:val="0"/>
                 <w:color w:val="142238"/>
@@ -1477,6 +1710,7 @@
           <w:p>
             <w:r>
               <w:rPr>
+                <w:rFonts w:ascii="Arial" w:hAnsi="Arial" w:eastAsia="Arial"/>
                 <w:b w:val="0"/>
                 <w:i w:val="0"/>
                 <w:color w:val="52657D"/>
@@ -1506,6 +1740,7 @@
           <w:p>
             <w:r>
               <w:rPr>
+                <w:rFonts w:ascii="Arial" w:hAnsi="Arial" w:eastAsia="Arial"/>
                 <w:b w:val="0"/>
                 <w:i w:val="0"/>
                 <w:color w:val="52657D"/>
@@ -1537,6 +1772,7 @@
           <w:p>
             <w:r>
               <w:rPr>
+                <w:rFonts w:ascii="Arial" w:hAnsi="Arial" w:eastAsia="Arial"/>
                 <w:b/>
                 <w:i w:val="0"/>
                 <w:color w:val="142238"/>
@@ -1566,6 +1802,7 @@
           <w:p>
             <w:r>
               <w:rPr>
+                <w:rFonts w:ascii="Arial" w:hAnsi="Arial" w:eastAsia="Arial"/>
                 <w:b w:val="0"/>
                 <w:i w:val="0"/>
                 <w:color w:val="52657D"/>
@@ -1595,6 +1832,7 @@
           <w:p>
             <w:r>
               <w:rPr>
+                <w:rFonts w:ascii="Arial" w:hAnsi="Arial" w:eastAsia="Arial"/>
                 <w:b w:val="0"/>
                 <w:i w:val="0"/>
                 <w:color w:val="52657D"/>
@@ -1611,78 +1849,7 @@
         <w:pStyle w:val="Heading2"/>
       </w:pPr>
       <w:r>
-        <w:t>History without fear</w:t>
-      </w:r>
-    </w:p>
-    <w:p>
-      <w:r>
-        <w:rPr>
-          <w:b/>
-          <w:i w:val="0"/>
-          <w:color w:val="142238"/>
-        </w:rPr>
-        <w:t xml:space="preserve">Make a change. </w:t>
-      </w:r>
-      <w:r>
-        <w:rPr>
-          <w:b/>
-          <w:i w:val="0"/>
-          <w:color w:val="7655D9"/>
-        </w:rPr>
-        <w:t xml:space="preserve">Undo it. </w:t>
-      </w:r>
-      <w:r>
-        <w:rPr>
-          <w:b/>
-          <w:i w:val="0"/>
-          <w:color w:val="245BDB"/>
-        </w:rPr>
-        <w:t xml:space="preserve">Redo it. </w:t>
-      </w:r>
-      <w:r>
-        <w:rPr>
-          <w:b w:val="0"/>
-          <w:i w:val="0"/>
-          <w:color w:val="52657D"/>
-        </w:rPr>
-        <w:t>The editor remounts only what changed, so the rest of the document stays stable.</w:t>
-      </w:r>
-    </w:p>
-    <w:p>
-      <w:r>
-        <w:br w:type="page"/>
-      </w:r>
-    </w:p>
-    <w:p>
-      <w:pPr>
-        <w:pStyle w:val="Kicker"/>
-      </w:pPr>
-      <w:r>
-        <w:rPr>
-          <w:b/>
-          <w:i w:val="0"/>
-          <w:color w:val="13BBD4"/>
-          <w:sz w:val="18"/>
-        </w:rPr>
-        <w:t>02 / UNDER THE HOOD</w:t>
-      </w:r>
-    </w:p>
-    <w:p>
-      <w:pPr>
-        <w:pStyle w:val="Heading1"/>
-      </w:pPr>
-      <w:r>
-        <w:t>A Word engine, not an upload form.</w:t>
-      </w:r>
-    </w:p>
-    <w:p>
-      <w:r>
-        <w:rPr>
-          <w:b w:val="0"/>
-          <w:i w:val="0"/>
-          <w:color w:val="52657D"/>
-        </w:rPr>
-        <w:t>Docxodus brings a trimmed .NET WebAssembly runtime and structure-aware OOXML editing into the browser. The source bytes stay local; the result remains a Word file.</w:t>
+        <w:t>What happened in the browser</w:t>
       </w:r>
     </w:p>
     <w:tbl>
@@ -1718,6 +1885,7 @@
           <w:p>
             <w:r>
               <w:rPr>
+                <w:rFonts w:ascii="Arial" w:hAnsi="Arial" w:eastAsia="Arial"/>
                 <w:b/>
                 <w:i w:val="0"/>
                 <w:color w:val="245BDB"/>
@@ -1729,6 +1897,7 @@
           <w:p>
             <w:r>
               <w:rPr>
+                <w:rFonts w:ascii="Arial" w:hAnsi="Arial" w:eastAsia="Arial"/>
                 <w:b/>
                 <w:i w:val="0"/>
                 <w:color w:val="142238"/>
@@ -1740,6 +1909,7 @@
           <w:p>
             <w:r>
               <w:rPr>
+                <w:rFonts w:ascii="Arial" w:hAnsi="Arial" w:eastAsia="Arial"/>
                 <w:b w:val="0"/>
                 <w:i w:val="0"/>
                 <w:color w:val="52657D"/>
@@ -1769,6 +1939,7 @@
           <w:p>
             <w:r>
               <w:rPr>
+                <w:rFonts w:ascii="Arial" w:hAnsi="Arial" w:eastAsia="Arial"/>
                 <w:b/>
                 <w:i w:val="0"/>
                 <w:color w:val="13BBD4"/>
@@ -1780,6 +1951,7 @@
           <w:p>
             <w:r>
               <w:rPr>
+                <w:rFonts w:ascii="Arial" w:hAnsi="Arial" w:eastAsia="Arial"/>
                 <w:b/>
                 <w:i w:val="0"/>
                 <w:color w:val="142238"/>
@@ -1791,6 +1963,7 @@
           <w:p>
             <w:r>
               <w:rPr>
+                <w:rFonts w:ascii="Arial" w:hAnsi="Arial" w:eastAsia="Arial"/>
                 <w:b w:val="0"/>
                 <w:i w:val="0"/>
                 <w:color w:val="52657D"/>
@@ -1820,6 +1993,7 @@
           <w:p>
             <w:r>
               <w:rPr>
+                <w:rFonts w:ascii="Arial" w:hAnsi="Arial" w:eastAsia="Arial"/>
                 <w:b/>
                 <w:i w:val="0"/>
                 <w:color w:val="159B72"/>
@@ -1831,6 +2005,7 @@
           <w:p>
             <w:r>
               <w:rPr>
+                <w:rFonts w:ascii="Arial" w:hAnsi="Arial" w:eastAsia="Arial"/>
                 <w:b/>
                 <w:i w:val="0"/>
                 <w:color w:val="142238"/>
@@ -1842,6 +2017,7 @@
           <w:p>
             <w:r>
               <w:rPr>
+                <w:rFonts w:ascii="Arial" w:hAnsi="Arial" w:eastAsia="Arial"/>
                 <w:b w:val="0"/>
                 <w:i w:val="0"/>
                 <w:color w:val="52657D"/>
@@ -1858,7 +2034,7 @@
         <w:pStyle w:val="Heading2"/>
       </w:pPr>
       <w:r>
-        <w:t>What never crosses the wire</w:t>
+        <w:t>What never leaves this tab</w:t>
       </w:r>
     </w:p>
     <w:p>
@@ -1868,6 +2044,7 @@
       </w:pPr>
       <w:r>
         <w:rPr>
+          <w:rFonts w:ascii="Arial" w:hAnsi="Arial" w:eastAsia="Arial"/>
           <w:b/>
           <w:i w:val="0"/>
           <w:color w:val="159B72"/>
@@ -1877,6 +2054,7 @@
       </w:r>
       <w:r>
         <w:rPr>
+          <w:rFonts w:ascii="Arial" w:hAnsi="Arial" w:eastAsia="Arial"/>
           <w:b w:val="0"/>
           <w:i w:val="0"/>
           <w:color w:val="52657D"/>
@@ -1892,6 +2070,7 @@
       </w:pPr>
       <w:r>
         <w:rPr>
+          <w:rFonts w:ascii="Arial" w:hAnsi="Arial" w:eastAsia="Arial"/>
           <w:b/>
           <w:i w:val="0"/>
           <w:color w:val="159B72"/>
@@ -1901,6 +2080,7 @@
       </w:r>
       <w:r>
         <w:rPr>
+          <w:rFonts w:ascii="Arial" w:hAnsi="Arial" w:eastAsia="Arial"/>
           <w:b w:val="0"/>
           <w:i w:val="0"/>
           <w:color w:val="52657D"/>
@@ -1916,6 +2096,7 @@
       </w:pPr>
       <w:r>
         <w:rPr>
+          <w:rFonts w:ascii="Arial" w:hAnsi="Arial" w:eastAsia="Arial"/>
           <w:b/>
           <w:i w:val="0"/>
           <w:color w:val="159B72"/>
@@ -1925,6 +2106,7 @@
       </w:r>
       <w:r>
         <w:rPr>
+          <w:rFonts w:ascii="Arial" w:hAnsi="Arial" w:eastAsia="Arial"/>
           <w:b w:val="0"/>
           <w:i w:val="0"/>
           <w:color w:val="52657D"/>
@@ -1964,6 +2146,7 @@
             </w:pPr>
             <w:r>
               <w:rPr>
+                <w:rFonts w:ascii="Arial" w:hAnsi="Arial" w:eastAsia="Arial"/>
                 <w:b/>
                 <w:i w:val="0"/>
                 <w:color w:val="159B72"/>
@@ -1978,6 +2161,7 @@
             </w:pPr>
             <w:r>
               <w:rPr>
+                <w:rFonts w:ascii="Arial" w:hAnsi="Arial" w:eastAsia="Arial"/>
                 <w:b/>
                 <w:i w:val="0"/>
                 <w:color w:val="142238"/>
@@ -1992,6 +2176,7 @@
             </w:pPr>
             <w:r>
               <w:rPr>
+                <w:rFonts w:ascii="Arial" w:hAnsi="Arial" w:eastAsia="Arial"/>
                 <w:b w:val="0"/>
                 <w:i w:val="0"/>
                 <w:color w:val="52657D"/>
@@ -2008,43 +2193,27 @@
         <w:pStyle w:val="Heading2"/>
       </w:pPr>
       <w:r>
-        <w:t>Continuous or page-aware</w:t>
+        <w:t>See the real page</w:t>
       </w:r>
     </w:p>
     <w:p>
       <w:r>
         <w:rPr>
+          <w:rFonts w:ascii="Arial" w:hAnsi="Arial" w:eastAsia="Arial"/>
           <w:b w:val="0"/>
           <w:i w:val="0"/>
           <w:color w:val="52657D"/>
         </w:rPr>
-        <w:t>Use Pages in the toolbar to switch from a continuous editing surface to document page boxes. The source file stays open and every edit remains available in either view.</w:t>
-      </w:r>
-    </w:p>
-    <w:p>
-      <w:pPr>
-        <w:pStyle w:val="Heading2"/>
-      </w:pPr>
-      <w:r>
-        <w:t>One final proof</w:t>
-      </w:r>
-    </w:p>
-    <w:p>
-      <w:r>
-        <w:rPr>
-          <w:b/>
-          <w:i w:val="0"/>
-          <w:color w:val="142238"/>
-        </w:rPr>
-        <w:t xml:space="preserve">Download this guide, open it in Word or LibreOffice, and inspect your edits. </w:t>
+        <w:t>Click Pages in the toolbar. The continuous editor becomes four Word-style page boxes without reopening the file or losing your edits.</w:t>
       </w:r>
       <w:r>
         <w:rPr>
+          <w:rFonts w:ascii="Arial" w:hAnsi="Arial" w:eastAsia="Arial"/>
           <w:b/>
           <w:i w:val="0"/>
           <w:color w:val="245BDB"/>
         </w:rPr>
-        <w:t>That round trip is the product.</w:t>
+        <w:t xml:space="preserve"> That round trip is the product.</w:t>
       </w:r>
     </w:p>
     <w:p>
@@ -2058,6 +2227,7 @@
       </w:pPr>
       <w:r>
         <w:rPr>
+          <w:rFonts w:ascii="Arial" w:hAnsi="Arial" w:eastAsia="Arial"/>
           <w:b/>
           <w:i w:val="0"/>
           <w:color w:val="13BBD4"/>
@@ -2077,6 +2247,7 @@
     <w:p>
       <w:r>
         <w:rPr>
+          <w:rFonts w:ascii="Arial" w:hAnsi="Arial" w:eastAsia="Arial"/>
           <w:b w:val="0"/>
           <w:i w:val="0"/>
           <w:color w:val="52657D"/>
@@ -2095,6 +2266,7 @@
     <w:p>
       <w:r>
         <w:rPr>
+          <w:rFonts w:ascii="Arial" w:hAnsi="Arial" w:eastAsia="Arial"/>
           <w:b w:val="0"/>
           <w:i w:val="0"/>
           <w:color w:val="52657D"/>
@@ -2135,7 +2307,7 @@
             </w:pPr>
             <w:r>
               <w:rPr>
-                <w:rFonts w:ascii="Aptos Mono" w:hAnsi="Aptos Mono" w:eastAsia="Aptos Mono"/>
+                <w:rFonts w:ascii="Courier New" w:hAnsi="Courier New" w:eastAsia="Courier New"/>
                 <w:b w:val="0"/>
                 <w:i w:val="0"/>
                 <w:color w:val="D7EBFF"/>
@@ -2150,7 +2322,7 @@
             </w:pPr>
             <w:r>
               <w:rPr>
-                <w:rFonts w:ascii="Aptos Mono" w:hAnsi="Aptos Mono" w:eastAsia="Aptos Mono"/>
+                <w:rFonts w:ascii="Courier New" w:hAnsi="Courier New" w:eastAsia="Courier New"/>
                 <w:b w:val="0"/>
                 <w:i w:val="0"/>
                 <w:color w:val="D7EBFF"/>
@@ -2165,7 +2337,7 @@
             </w:pPr>
             <w:r>
               <w:rPr>
-                <w:rFonts w:ascii="Aptos Mono" w:hAnsi="Aptos Mono" w:eastAsia="Aptos Mono"/>
+                <w:rFonts w:ascii="Courier New" w:hAnsi="Courier New" w:eastAsia="Courier New"/>
                 <w:b w:val="0"/>
                 <w:i w:val="0"/>
                 <w:color w:val="D7EBFF"/>
@@ -2180,7 +2352,7 @@
             </w:pPr>
             <w:r>
               <w:rPr>
-                <w:rFonts w:ascii="Aptos Mono" w:hAnsi="Aptos Mono" w:eastAsia="Aptos Mono"/>
+                <w:rFonts w:ascii="Courier New" w:hAnsi="Courier New" w:eastAsia="Courier New"/>
                 <w:b w:val="0"/>
                 <w:i w:val="0"/>
                 <w:color w:val="D7EBFF"/>
@@ -2203,6 +2375,7 @@
     <w:p>
       <w:r>
         <w:rPr>
+          <w:rFonts w:ascii="Arial" w:hAnsi="Arial" w:eastAsia="Arial"/>
           <w:b w:val="0"/>
           <w:i w:val="0"/>
           <w:color w:val="52657D"/>
@@ -2243,7 +2416,7 @@
             </w:pPr>
             <w:r>
               <w:rPr>
-                <w:rFonts w:ascii="Aptos Mono" w:hAnsi="Aptos Mono" w:eastAsia="Aptos Mono"/>
+                <w:rFonts w:ascii="Courier New" w:hAnsi="Courier New" w:eastAsia="Courier New"/>
                 <w:b w:val="0"/>
                 <w:i w:val="0"/>
                 <w:color w:val="D7EBFF"/>
@@ -2258,7 +2431,7 @@
             </w:pPr>
             <w:r>
               <w:rPr>
-                <w:rFonts w:ascii="Aptos Mono" w:hAnsi="Aptos Mono" w:eastAsia="Aptos Mono"/>
+                <w:rFonts w:ascii="Courier New" w:hAnsi="Courier New" w:eastAsia="Courier New"/>
                 <w:b w:val="0"/>
                 <w:i w:val="0"/>
                 <w:color w:val="D7EBFF"/>
@@ -2273,7 +2446,7 @@
             </w:pPr>
             <w:r>
               <w:rPr>
-                <w:rFonts w:ascii="Aptos Mono" w:hAnsi="Aptos Mono" w:eastAsia="Aptos Mono"/>
+                <w:rFonts w:ascii="Courier New" w:hAnsi="Courier New" w:eastAsia="Courier New"/>
                 <w:b w:val="0"/>
                 <w:i w:val="0"/>
                 <w:color w:val="D7EBFF"/>
@@ -2288,7 +2461,7 @@
             </w:pPr>
             <w:r>
               <w:rPr>
-                <w:rFonts w:ascii="Aptos Mono" w:hAnsi="Aptos Mono" w:eastAsia="Aptos Mono"/>
+                <w:rFonts w:ascii="Courier New" w:hAnsi="Courier New" w:eastAsia="Courier New"/>
                 <w:b w:val="0"/>
                 <w:i w:val="0"/>
                 <w:color w:val="D7EBFF"/>
@@ -2331,6 +2504,7 @@
             </w:pPr>
             <w:r>
               <w:rPr>
+                <w:rFonts w:ascii="Arial" w:hAnsi="Arial" w:eastAsia="Arial"/>
                 <w:b/>
                 <w:i w:val="0"/>
                 <w:color w:val="7655D9"/>
@@ -2345,6 +2519,7 @@
             </w:pPr>
             <w:r>
               <w:rPr>
+                <w:rFonts w:ascii="Arial" w:hAnsi="Arial" w:eastAsia="Arial"/>
                 <w:b/>
                 <w:i w:val="0"/>
                 <w:color w:val="142238"/>
@@ -2359,6 +2534,7 @@
             </w:pPr>
             <w:r>
               <w:rPr>
+                <w:rFonts w:ascii="Arial" w:hAnsi="Arial" w:eastAsia="Arial"/>
                 <w:b w:val="0"/>
                 <w:i w:val="0"/>
                 <w:color w:val="52657D"/>
@@ -2382,6 +2558,7 @@
       <w:hyperlink r:id="rId11">
         <w:r>
           <w:rPr>
+            <w:rFonts w:ascii="Arial" w:hAnsi="Arial" w:eastAsia="Arial"/>
             <w:color w:val="245BDB"/>
             <w:u w:val="single"/>
           </w:rPr>
@@ -2390,6 +2567,7 @@
       </w:hyperlink>
       <w:r>
         <w:rPr>
+          <w:rFonts w:ascii="Arial" w:hAnsi="Arial" w:eastAsia="Arial"/>
           <w:b w:val="0"/>
           <w:i w:val="0"/>
           <w:color w:val="CED9E7"/>
@@ -2399,6 +2577,7 @@
       <w:hyperlink r:id="rId12">
         <w:r>
           <w:rPr>
+            <w:rFonts w:ascii="Arial" w:hAnsi="Arial" w:eastAsia="Arial"/>
             <w:color w:val="245BDB"/>
             <w:u w:val="single"/>
           </w:rPr>
@@ -2407,6 +2586,7 @@
       </w:hyperlink>
       <w:r>
         <w:rPr>
+          <w:rFonts w:ascii="Arial" w:hAnsi="Arial" w:eastAsia="Arial"/>
           <w:b w:val="0"/>
           <w:i w:val="0"/>
           <w:color w:val="CED9E7"/>
@@ -2416,6 +2596,7 @@
       <w:hyperlink r:id="rId13">
         <w:r>
           <w:rPr>
+            <w:rFonts w:ascii="Arial" w:hAnsi="Arial" w:eastAsia="Arial"/>
             <w:color w:val="245BDB"/>
             <w:u w:val="single"/>
           </w:rPr>
@@ -2430,6 +2611,7 @@
       </w:pPr>
       <w:r>
         <w:rPr>
+          <w:rFonts w:ascii="Arial" w:hAnsi="Arial" w:eastAsia="Arial"/>
           <w:b/>
           <w:i w:val="0"/>
           <w:color w:val="13BBD4"/>
@@ -2444,6 +2626,7 @@
       </w:pPr>
       <w:r>
         <w:rPr>
+          <w:rFonts w:ascii="Arial" w:hAnsi="Arial" w:eastAsia="Arial"/>
           <w:b/>
           <w:i w:val="0"/>
           <w:color w:val="071A2D"/>
@@ -2473,6 +2656,7 @@
     </w:pPr>
     <w:r>
       <w:rPr>
+        <w:rFonts w:ascii="Arial" w:hAnsi="Arial" w:eastAsia="Arial"/>
         <w:b w:val="0"/>
         <w:i w:val="0"/>
         <w:color w:val="52657D"/>
@@ -2503,6 +2687,7 @@
     </w:pPr>
     <w:r>
       <w:rPr>
+        <w:rFonts w:ascii="Arial" w:hAnsi="Arial" w:eastAsia="Arial"/>
         <w:b/>
         <w:i w:val="0"/>
         <w:color w:val="245BDB"/>
@@ -2512,6 +2697,7 @@
     </w:r>
     <w:r>
       <w:rPr>
+        <w:rFonts w:ascii="Arial" w:hAnsi="Arial" w:eastAsia="Arial"/>
         <w:b w:val="0"/>
         <w:i w:val="0"/>
         <w:color w:val="52657D"/>
@@ -2890,7 +3076,7 @@
       <w:spacing w:after="140" w:line="240" w:lineRule="auto"/>
     </w:pPr>
     <w:rPr>
-      <w:rFonts w:ascii="Aptos" w:hAnsi="Aptos" w:eastAsia="Aptos"/>
+      <w:rFonts w:ascii="Arial" w:hAnsi="Arial" w:eastAsia="Arial"/>
       <w:color w:val="142238"/>
       <w:sz w:val="21"/>
     </w:rPr>
@@ -2954,7 +3140,7 @@
       <w:outlineLvl w:val="0"/>
     </w:pPr>
     <w:rPr>
-      <w:rFonts w:asciiTheme="majorHAnsi" w:eastAsiaTheme="majorEastAsia" w:hAnsiTheme="majorHAnsi" w:cstheme="majorBidi" w:ascii="Aptos Display" w:hAnsi="Aptos Display" w:eastAsia="Aptos Display"/>
+      <w:rFonts w:asciiTheme="majorHAnsi" w:eastAsiaTheme="majorEastAsia" w:hAnsiTheme="majorHAnsi" w:cstheme="majorBidi" w:ascii="Arial" w:hAnsi="Arial" w:eastAsia="Arial"/>
       <w:b/>
       <w:bCs/>
       <w:color w:val="071A2D"/>
@@ -2978,7 +3164,7 @@
       <w:outlineLvl w:val="1"/>
     </w:pPr>
     <w:rPr>
-      <w:rFonts w:asciiTheme="majorHAnsi" w:eastAsiaTheme="majorEastAsia" w:hAnsiTheme="majorHAnsi" w:cstheme="majorBidi" w:ascii="Aptos Display" w:hAnsi="Aptos Display" w:eastAsia="Aptos Display"/>
+      <w:rFonts w:asciiTheme="majorHAnsi" w:eastAsiaTheme="majorEastAsia" w:hAnsiTheme="majorHAnsi" w:cstheme="majorBidi" w:ascii="Arial" w:hAnsi="Arial" w:eastAsia="Arial"/>
       <w:b/>
       <w:bCs/>
       <w:color w:val="102A46"/>
@@ -3002,7 +3188,7 @@
       <w:outlineLvl w:val="2"/>
     </w:pPr>
     <w:rPr>
-      <w:rFonts w:asciiTheme="majorHAnsi" w:eastAsiaTheme="majorEastAsia" w:hAnsiTheme="majorHAnsi" w:cstheme="majorBidi" w:ascii="Aptos Display" w:hAnsi="Aptos Display" w:eastAsia="Aptos Display"/>
+      <w:rFonts w:asciiTheme="majorHAnsi" w:eastAsiaTheme="majorEastAsia" w:hAnsiTheme="majorHAnsi" w:cstheme="majorBidi" w:ascii="Arial" w:hAnsi="Arial" w:eastAsia="Arial"/>
       <w:b/>
       <w:bCs/>
       <w:color w:val="245BDB"/>
@@ -3244,7 +3430,7 @@
       <w:contextualSpacing/>
     </w:pPr>
     <w:rPr>
-      <w:rFonts w:asciiTheme="majorHAnsi" w:eastAsiaTheme="majorEastAsia" w:hAnsiTheme="majorHAnsi" w:cstheme="majorBidi" w:ascii="Aptos Display" w:hAnsi="Aptos Display" w:eastAsia="Aptos Display"/>
+      <w:rFonts w:asciiTheme="majorHAnsi" w:eastAsiaTheme="majorEastAsia" w:hAnsiTheme="majorHAnsi" w:cstheme="majorBidi" w:ascii="Arial" w:hAnsi="Arial" w:eastAsia="Arial"/>
       <w:b/>
       <w:color w:val="FFFFFF"/>
       <w:spacing w:val="5"/>
@@ -3283,7 +3469,7 @@
       <w:spacing w:before="0" w:after="0"/>
     </w:pPr>
     <w:rPr>
-      <w:rFonts w:asciiTheme="majorHAnsi" w:eastAsiaTheme="majorEastAsia" w:hAnsiTheme="majorHAnsi" w:cstheme="majorBidi" w:ascii="Aptos Display" w:hAnsi="Aptos Display" w:eastAsia="Aptos Display"/>
+      <w:rFonts w:asciiTheme="majorHAnsi" w:eastAsiaTheme="majorEastAsia" w:hAnsiTheme="majorHAnsi" w:cstheme="majorBidi" w:ascii="Arial" w:hAnsi="Arial" w:eastAsia="Arial"/>
       <w:b w:val="0"/>
       <w:i/>
       <w:iCs/>
@@ -14588,7 +14774,7 @@
       <w:keepNext/>
     </w:pPr>
     <w:rPr>
-      <w:rFonts w:ascii="Aptos" w:hAnsi="Aptos"/>
+      <w:rFonts w:ascii="Arial" w:hAnsi="Arial"/>
       <w:b/>
       <w:color w:val="13BBD4"/>
       <w:sz w:val="18"/>
@@ -14601,7 +14787,7 @@
       <w:ind w:left="259" w:right="259"/>
     </w:pPr>
     <w:rPr>
-      <w:rFonts w:ascii="Aptos Mono" w:hAnsi="Aptos Mono"/>
+      <w:rFonts w:ascii="Courier New" w:hAnsi="Courier New"/>
       <w:color w:val="D7EBFF"/>
       <w:sz w:val="17"/>
     </w:rPr>

</xml_diff>